<commit_message>
Deploying to gh-pages from @ UCD-SERG/serocalculator@440f4cd73161c4f714608074885c6822bd729c7f 🚀
</commit_message>
<xml_diff>
--- a/dev/vignettes/articles/version-crosswalk-1.3-to-1.4.docx
+++ b/dev/vignettes/articles/version-crosswalk-1.3-to-1.4.docx
@@ -1699,70 +1699,70 @@
         <w:rPr>
           <w:rStyle w:val="VerbatimChar"/>
         </w:rPr>
-        <w:t xml:space="preserve">#&gt;     age id    antigen_iso value</w:t>
-      </w:r>
-      <w:r>
-        <w:br/>
-      </w:r>
-      <w:r>
-        <w:rPr>
-          <w:rStyle w:val="VerbatimChar"/>
-        </w:rPr>
-        <w:t xml:space="preserve">#&gt;   &lt;dbl&gt; &lt;chr&gt; &lt;chr&gt;       &lt;dbl&gt;</w:t>
-      </w:r>
-      <w:r>
-        <w:br/>
-      </w:r>
-      <w:r>
-        <w:rPr>
-          <w:rStyle w:val="VerbatimChar"/>
-        </w:rPr>
-        <w:t xml:space="preserve">#&gt; 1 18.0  1     HlyE_IgA    2.12 </w:t>
-      </w:r>
-      <w:r>
-        <w:br/>
-      </w:r>
-      <w:r>
-        <w:rPr>
-          <w:rStyle w:val="VerbatimChar"/>
-        </w:rPr>
-        <w:t xml:space="preserve">#&gt; 2 18.0  1     HlyE_IgG    1.87 </w:t>
-      </w:r>
-      <w:r>
-        <w:br/>
-      </w:r>
-      <w:r>
-        <w:rPr>
-          <w:rStyle w:val="VerbatimChar"/>
-        </w:rPr>
-        <w:t xml:space="preserve">#&gt; 3 14.8  2     HlyE_IgA    0.148</w:t>
-      </w:r>
-      <w:r>
-        <w:br/>
-      </w:r>
-      <w:r>
-        <w:rPr>
-          <w:rStyle w:val="VerbatimChar"/>
-        </w:rPr>
-        <w:t xml:space="preserve">#&gt; 4 14.8  2     HlyE_IgG    3.56 </w:t>
-      </w:r>
-      <w:r>
-        <w:br/>
-      </w:r>
-      <w:r>
-        <w:rPr>
-          <w:rStyle w:val="VerbatimChar"/>
-        </w:rPr>
-        <w:t xml:space="preserve">#&gt; 5  8.67 3     HlyE_IgA    0.286</w:t>
-      </w:r>
-      <w:r>
-        <w:br/>
-      </w:r>
-      <w:r>
-        <w:rPr>
-          <w:rStyle w:val="VerbatimChar"/>
-        </w:rPr>
-        <w:t xml:space="preserve">#&gt; 6  8.67 3     HlyE_IgG    0.335</w:t>
+        <w:t xml:space="preserve">#&gt;     age id    antigen_iso     value</w:t>
+      </w:r>
+      <w:r>
+        <w:br/>
+      </w:r>
+      <w:r>
+        <w:rPr>
+          <w:rStyle w:val="VerbatimChar"/>
+        </w:rPr>
+        <w:t xml:space="preserve">#&gt;   &lt;dbl&gt; &lt;chr&gt; &lt;chr&gt;           &lt;dbl&gt;</w:t>
+      </w:r>
+      <w:r>
+        <w:br/>
+      </w:r>
+      <w:r>
+        <w:rPr>
+          <w:rStyle w:val="VerbatimChar"/>
+        </w:rPr>
+        <w:t xml:space="preserve">#&gt; 1 12.0  1     HlyE_IgA        0.166</w:t>
+      </w:r>
+      <w:r>
+        <w:br/>
+      </w:r>
+      <w:r>
+        <w:rPr>
+          <w:rStyle w:val="VerbatimChar"/>
+        </w:rPr>
+        <w:t xml:space="preserve">#&gt; 2 12.0  1     HlyE_IgG        0.256</w:t>
+      </w:r>
+      <w:r>
+        <w:br/>
+      </w:r>
+      <w:r>
+        <w:rPr>
+          <w:rStyle w:val="VerbatimChar"/>
+        </w:rPr>
+        <w:t xml:space="preserve">#&gt; 3 13.7  2     HlyE_IgA        0.549</w:t>
+      </w:r>
+      <w:r>
+        <w:br/>
+      </w:r>
+      <w:r>
+        <w:rPr>
+          <w:rStyle w:val="VerbatimChar"/>
+        </w:rPr>
+        <w:t xml:space="preserve">#&gt; 4 13.7  2     HlyE_IgG        0.932</w:t>
+      </w:r>
+      <w:r>
+        <w:br/>
+      </w:r>
+      <w:r>
+        <w:rPr>
+          <w:rStyle w:val="VerbatimChar"/>
+        </w:rPr>
+        <w:t xml:space="preserve">#&gt; 5  2.87 3     HlyE_IgA      857.   </w:t>
+      </w:r>
+      <w:r>
+        <w:br/>
+      </w:r>
+      <w:r>
+        <w:rPr>
+          <w:rStyle w:val="VerbatimChar"/>
+        </w:rPr>
+        <w:t xml:space="preserve">#&gt; 6  2.87 3     HlyE_IgG    12764.</w:t>
       </w:r>
       <w:r>
         <w:br/>

</xml_diff>

<commit_message>
Deploying to gh-pages from @ UCD-SERG/serocalculator@fb8a0b7ec7da7f5300a95b45aa93b39cbb947e0c 🚀
</commit_message>
<xml_diff>
--- a/dev/vignettes/articles/version-crosswalk-1.3-to-1.4.docx
+++ b/dev/vignettes/articles/version-crosswalk-1.3-to-1.4.docx
@@ -23,7 +23,7 @@
         <w:pStyle w:val="Date"/>
       </w:pPr>
       <w:r>
-        <w:t xml:space="preserve">Invalid Date</w:t>
+        <w:t xml:space="preserve">2026-07-25</w:t>
       </w:r>
     </w:p>
     <w:bookmarkStart w:id="9" w:name="overview"/>
@@ -1699,70 +1699,70 @@
         <w:rPr>
           <w:rStyle w:val="VerbatimChar"/>
         </w:rPr>
-        <w:t xml:space="preserve">#&gt;     age id    antigen_iso     value</w:t>
-      </w:r>
-      <w:r>
-        <w:br/>
-      </w:r>
-      <w:r>
-        <w:rPr>
-          <w:rStyle w:val="VerbatimChar"/>
-        </w:rPr>
-        <w:t xml:space="preserve">#&gt;   &lt;dbl&gt; &lt;chr&gt; &lt;chr&gt;           &lt;dbl&gt;</w:t>
-      </w:r>
-      <w:r>
-        <w:br/>
-      </w:r>
-      <w:r>
-        <w:rPr>
-          <w:rStyle w:val="VerbatimChar"/>
-        </w:rPr>
-        <w:t xml:space="preserve">#&gt; 1 12.0  1     HlyE_IgA        0.166</w:t>
-      </w:r>
-      <w:r>
-        <w:br/>
-      </w:r>
-      <w:r>
-        <w:rPr>
-          <w:rStyle w:val="VerbatimChar"/>
-        </w:rPr>
-        <w:t xml:space="preserve">#&gt; 2 12.0  1     HlyE_IgG        0.256</w:t>
-      </w:r>
-      <w:r>
-        <w:br/>
-      </w:r>
-      <w:r>
-        <w:rPr>
-          <w:rStyle w:val="VerbatimChar"/>
-        </w:rPr>
-        <w:t xml:space="preserve">#&gt; 3 13.7  2     HlyE_IgA        0.549</w:t>
-      </w:r>
-      <w:r>
-        <w:br/>
-      </w:r>
-      <w:r>
-        <w:rPr>
-          <w:rStyle w:val="VerbatimChar"/>
-        </w:rPr>
-        <w:t xml:space="preserve">#&gt; 4 13.7  2     HlyE_IgG        0.932</w:t>
-      </w:r>
-      <w:r>
-        <w:br/>
-      </w:r>
-      <w:r>
-        <w:rPr>
-          <w:rStyle w:val="VerbatimChar"/>
-        </w:rPr>
-        <w:t xml:space="preserve">#&gt; 5  2.87 3     HlyE_IgA      857.   </w:t>
-      </w:r>
-      <w:r>
-        <w:br/>
-      </w:r>
-      <w:r>
-        <w:rPr>
-          <w:rStyle w:val="VerbatimChar"/>
-        </w:rPr>
-        <w:t xml:space="preserve">#&gt; 6  2.87 3     HlyE_IgG    12764.</w:t>
+        <w:t xml:space="preserve">#&gt;     age id    antigen_iso value</w:t>
+      </w:r>
+      <w:r>
+        <w:br/>
+      </w:r>
+      <w:r>
+        <w:rPr>
+          <w:rStyle w:val="VerbatimChar"/>
+        </w:rPr>
+        <w:t xml:space="preserve">#&gt;   &lt;dbl&gt; &lt;chr&gt; &lt;chr&gt;       &lt;dbl&gt;</w:t>
+      </w:r>
+      <w:r>
+        <w:br/>
+      </w:r>
+      <w:r>
+        <w:rPr>
+          <w:rStyle w:val="VerbatimChar"/>
+        </w:rPr>
+        <w:t xml:space="preserve">#&gt; 1 10.3  1     HlyE_IgA    2.10 </w:t>
+      </w:r>
+      <w:r>
+        <w:br/>
+      </w:r>
+      <w:r>
+        <w:rPr>
+          <w:rStyle w:val="VerbatimChar"/>
+        </w:rPr>
+        <w:t xml:space="preserve">#&gt; 2 10.3  1     HlyE_IgG    2.31 </w:t>
+      </w:r>
+      <w:r>
+        <w:br/>
+      </w:r>
+      <w:r>
+        <w:rPr>
+          <w:rStyle w:val="VerbatimChar"/>
+        </w:rPr>
+        <w:t xml:space="preserve">#&gt; 3 17.8  2     HlyE_IgA    0.646</w:t>
+      </w:r>
+      <w:r>
+        <w:br/>
+      </w:r>
+      <w:r>
+        <w:rPr>
+          <w:rStyle w:val="VerbatimChar"/>
+        </w:rPr>
+        <w:t xml:space="preserve">#&gt; 4 17.8  2     HlyE_IgG    1.91 </w:t>
+      </w:r>
+      <w:r>
+        <w:br/>
+      </w:r>
+      <w:r>
+        <w:rPr>
+          <w:rStyle w:val="VerbatimChar"/>
+        </w:rPr>
+        <w:t xml:space="preserve">#&gt; 5  5.97 3     HlyE_IgA    0.892</w:t>
+      </w:r>
+      <w:r>
+        <w:br/>
+      </w:r>
+      <w:r>
+        <w:rPr>
+          <w:rStyle w:val="VerbatimChar"/>
+        </w:rPr>
+        <w:t xml:space="preserve">#&gt; 6  5.97 3     HlyE_IgG    0.358</w:t>
       </w:r>
       <w:r>
         <w:br/>

</xml_diff>

<commit_message>
Deploying to gh-pages from @ UCD-SERG/serocalculator@f7be67be5e1601361590988f9891385771c1757a 🚀
</commit_message>
<xml_diff>
--- a/dev/vignettes/articles/version-crosswalk-1.3-to-1.4.docx
+++ b/dev/vignettes/articles/version-crosswalk-1.3-to-1.4.docx
@@ -1717,52 +1717,52 @@
         <w:rPr>
           <w:rStyle w:val="VerbatimChar"/>
         </w:rPr>
-        <w:t xml:space="preserve">#&gt; 1 10.3  1     HlyE_IgA    2.10 </w:t>
-      </w:r>
-      <w:r>
-        <w:br/>
-      </w:r>
-      <w:r>
-        <w:rPr>
-          <w:rStyle w:val="VerbatimChar"/>
-        </w:rPr>
-        <w:t xml:space="preserve">#&gt; 2 10.3  1     HlyE_IgG    2.31 </w:t>
-      </w:r>
-      <w:r>
-        <w:br/>
-      </w:r>
-      <w:r>
-        <w:rPr>
-          <w:rStyle w:val="VerbatimChar"/>
-        </w:rPr>
-        <w:t xml:space="preserve">#&gt; 3 17.8  2     HlyE_IgA    0.646</w:t>
-      </w:r>
-      <w:r>
-        <w:br/>
-      </w:r>
-      <w:r>
-        <w:rPr>
-          <w:rStyle w:val="VerbatimChar"/>
-        </w:rPr>
-        <w:t xml:space="preserve">#&gt; 4 17.8  2     HlyE_IgG    1.91 </w:t>
-      </w:r>
-      <w:r>
-        <w:br/>
-      </w:r>
-      <w:r>
-        <w:rPr>
-          <w:rStyle w:val="VerbatimChar"/>
-        </w:rPr>
-        <w:t xml:space="preserve">#&gt; 5  5.97 3     HlyE_IgA    0.892</w:t>
-      </w:r>
-      <w:r>
-        <w:br/>
-      </w:r>
-      <w:r>
-        <w:rPr>
-          <w:rStyle w:val="VerbatimChar"/>
-        </w:rPr>
-        <w:t xml:space="preserve">#&gt; 6  5.97 3     HlyE_IgG    0.358</w:t>
+        <w:t xml:space="preserve">#&gt; 1  2.2  1     HlyE_IgA    0.734</w:t>
+      </w:r>
+      <w:r>
+        <w:br/>
+      </w:r>
+      <w:r>
+        <w:rPr>
+          <w:rStyle w:val="VerbatimChar"/>
+        </w:rPr>
+        <w:t xml:space="preserve">#&gt; 2  2.2  1     HlyE_IgG    0.461</w:t>
+      </w:r>
+      <w:r>
+        <w:br/>
+      </w:r>
+      <w:r>
+        <w:rPr>
+          <w:rStyle w:val="VerbatimChar"/>
+        </w:rPr>
+        <w:t xml:space="preserve">#&gt; 3 13.5  2     HlyE_IgA    0.749</w:t>
+      </w:r>
+      <w:r>
+        <w:br/>
+      </w:r>
+      <w:r>
+        <w:rPr>
+          <w:rStyle w:val="VerbatimChar"/>
+        </w:rPr>
+        <w:t xml:space="preserve">#&gt; 4 13.5  2     HlyE_IgG    0.309</w:t>
+      </w:r>
+      <w:r>
+        <w:br/>
+      </w:r>
+      <w:r>
+        <w:rPr>
+          <w:rStyle w:val="VerbatimChar"/>
+        </w:rPr>
+        <w:t xml:space="preserve">#&gt; 5  1.79 3     HlyE_IgA    0.757</w:t>
+      </w:r>
+      <w:r>
+        <w:br/>
+      </w:r>
+      <w:r>
+        <w:rPr>
+          <w:rStyle w:val="VerbatimChar"/>
+        </w:rPr>
+        <w:t xml:space="preserve">#&gt; 6  1.79 3     HlyE_IgG    0.573</w:t>
       </w:r>
       <w:r>
         <w:br/>

</xml_diff>

<commit_message>
Deploying to gh-pages from @ UCD-SERG/serocalculator@6cd84aa2c0cb2512ed06276b3bdaf04daaa896c9 🚀
</commit_message>
<xml_diff>
--- a/dev/vignettes/articles/version-crosswalk-1.3-to-1.4.docx
+++ b/dev/vignettes/articles/version-crosswalk-1.3-to-1.4.docx
@@ -1699,70 +1699,70 @@
         <w:rPr>
           <w:rStyle w:val="VerbatimChar"/>
         </w:rPr>
-        <w:t xml:space="preserve">#&gt;     age id    antigen_iso value</w:t>
-      </w:r>
-      <w:r>
-        <w:br/>
-      </w:r>
-      <w:r>
-        <w:rPr>
-          <w:rStyle w:val="VerbatimChar"/>
-        </w:rPr>
-        <w:t xml:space="preserve">#&gt;   &lt;dbl&gt; &lt;chr&gt; &lt;chr&gt;       &lt;dbl&gt;</w:t>
-      </w:r>
-      <w:r>
-        <w:br/>
-      </w:r>
-      <w:r>
-        <w:rPr>
-          <w:rStyle w:val="VerbatimChar"/>
-        </w:rPr>
-        <w:t xml:space="preserve">#&gt; 1  2.2  1     HlyE_IgA    0.734</w:t>
-      </w:r>
-      <w:r>
-        <w:br/>
-      </w:r>
-      <w:r>
-        <w:rPr>
-          <w:rStyle w:val="VerbatimChar"/>
-        </w:rPr>
-        <w:t xml:space="preserve">#&gt; 2  2.2  1     HlyE_IgG    0.461</w:t>
-      </w:r>
-      <w:r>
-        <w:br/>
-      </w:r>
-      <w:r>
-        <w:rPr>
-          <w:rStyle w:val="VerbatimChar"/>
-        </w:rPr>
-        <w:t xml:space="preserve">#&gt; 3 13.5  2     HlyE_IgA    0.749</w:t>
-      </w:r>
-      <w:r>
-        <w:br/>
-      </w:r>
-      <w:r>
-        <w:rPr>
-          <w:rStyle w:val="VerbatimChar"/>
-        </w:rPr>
-        <w:t xml:space="preserve">#&gt; 4 13.5  2     HlyE_IgG    0.309</w:t>
-      </w:r>
-      <w:r>
-        <w:br/>
-      </w:r>
-      <w:r>
-        <w:rPr>
-          <w:rStyle w:val="VerbatimChar"/>
-        </w:rPr>
-        <w:t xml:space="preserve">#&gt; 5  1.79 3     HlyE_IgA    0.757</w:t>
-      </w:r>
-      <w:r>
-        <w:br/>
-      </w:r>
-      <w:r>
-        <w:rPr>
-          <w:rStyle w:val="VerbatimChar"/>
-        </w:rPr>
-        <w:t xml:space="preserve">#&gt; 6  1.79 3     HlyE_IgG    0.573</w:t>
+        <w:t xml:space="preserve">#&gt;     age id    antigen_iso   value</w:t>
+      </w:r>
+      <w:r>
+        <w:br/>
+      </w:r>
+      <w:r>
+        <w:rPr>
+          <w:rStyle w:val="VerbatimChar"/>
+        </w:rPr>
+        <w:t xml:space="preserve">#&gt;   &lt;dbl&gt; &lt;chr&gt; &lt;chr&gt;         &lt;dbl&gt;</w:t>
+      </w:r>
+      <w:r>
+        <w:br/>
+      </w:r>
+      <w:r>
+        <w:rPr>
+          <w:rStyle w:val="VerbatimChar"/>
+        </w:rPr>
+        <w:t xml:space="preserve">#&gt; 1  9.74 1     HlyE_IgA      0.509</w:t>
+      </w:r>
+      <w:r>
+        <w:br/>
+      </w:r>
+      <w:r>
+        <w:rPr>
+          <w:rStyle w:val="VerbatimChar"/>
+        </w:rPr>
+        <w:t xml:space="preserve">#&gt; 2  9.74 1     HlyE_IgG      0.435</w:t>
+      </w:r>
+      <w:r>
+        <w:br/>
+      </w:r>
+      <w:r>
+        <w:rPr>
+          <w:rStyle w:val="VerbatimChar"/>
+        </w:rPr>
+        <w:t xml:space="preserve">#&gt; 3 13.7  2     HlyE_IgA     82.4  </w:t>
+      </w:r>
+      <w:r>
+        <w:br/>
+      </w:r>
+      <w:r>
+        <w:rPr>
+          <w:rStyle w:val="VerbatimChar"/>
+        </w:rPr>
+        <w:t xml:space="preserve">#&gt; 4 13.7  2     HlyE_IgG    123.   </w:t>
+      </w:r>
+      <w:r>
+        <w:br/>
+      </w:r>
+      <w:r>
+        <w:rPr>
+          <w:rStyle w:val="VerbatimChar"/>
+        </w:rPr>
+        <w:t xml:space="preserve">#&gt; 5 10.8  3     HlyE_IgA      2.46 </w:t>
+      </w:r>
+      <w:r>
+        <w:br/>
+      </w:r>
+      <w:r>
+        <w:rPr>
+          <w:rStyle w:val="VerbatimChar"/>
+        </w:rPr>
+        <w:t xml:space="preserve">#&gt; 6 10.8  3     HlyE_IgG      8.91</w:t>
       </w:r>
       <w:r>
         <w:br/>

</xml_diff>

<commit_message>
Deploying to gh-pages from @ UCD-SERG/serocalculator@494dcf960bc07caaab442fef1ce590f710adbd45 🚀
</commit_message>
<xml_diff>
--- a/dev/vignettes/articles/version-crosswalk-1.3-to-1.4.docx
+++ b/dev/vignettes/articles/version-crosswalk-1.3-to-1.4.docx
@@ -1699,70 +1699,70 @@
         <w:rPr>
           <w:rStyle w:val="VerbatimChar"/>
         </w:rPr>
-        <w:t xml:space="preserve">#&gt;     age id    antigen_iso   value</w:t>
-      </w:r>
-      <w:r>
-        <w:br/>
-      </w:r>
-      <w:r>
-        <w:rPr>
-          <w:rStyle w:val="VerbatimChar"/>
-        </w:rPr>
-        <w:t xml:space="preserve">#&gt;   &lt;dbl&gt; &lt;chr&gt; &lt;chr&gt;         &lt;dbl&gt;</w:t>
-      </w:r>
-      <w:r>
-        <w:br/>
-      </w:r>
-      <w:r>
-        <w:rPr>
-          <w:rStyle w:val="VerbatimChar"/>
-        </w:rPr>
-        <w:t xml:space="preserve">#&gt; 1  9.74 1     HlyE_IgA      0.509</w:t>
-      </w:r>
-      <w:r>
-        <w:br/>
-      </w:r>
-      <w:r>
-        <w:rPr>
-          <w:rStyle w:val="VerbatimChar"/>
-        </w:rPr>
-        <w:t xml:space="preserve">#&gt; 2  9.74 1     HlyE_IgG      0.435</w:t>
-      </w:r>
-      <w:r>
-        <w:br/>
-      </w:r>
-      <w:r>
-        <w:rPr>
-          <w:rStyle w:val="VerbatimChar"/>
-        </w:rPr>
-        <w:t xml:space="preserve">#&gt; 3 13.7  2     HlyE_IgA     82.4  </w:t>
-      </w:r>
-      <w:r>
-        <w:br/>
-      </w:r>
-      <w:r>
-        <w:rPr>
-          <w:rStyle w:val="VerbatimChar"/>
-        </w:rPr>
-        <w:t xml:space="preserve">#&gt; 4 13.7  2     HlyE_IgG    123.   </w:t>
-      </w:r>
-      <w:r>
-        <w:br/>
-      </w:r>
-      <w:r>
-        <w:rPr>
-          <w:rStyle w:val="VerbatimChar"/>
-        </w:rPr>
-        <w:t xml:space="preserve">#&gt; 5 10.8  3     HlyE_IgA      2.46 </w:t>
-      </w:r>
-      <w:r>
-        <w:br/>
-      </w:r>
-      <w:r>
-        <w:rPr>
-          <w:rStyle w:val="VerbatimChar"/>
-        </w:rPr>
-        <w:t xml:space="preserve">#&gt; 6 10.8  3     HlyE_IgG      8.91</w:t>
+        <w:t xml:space="preserve">#&gt;     age id    antigen_iso    value</w:t>
+      </w:r>
+      <w:r>
+        <w:br/>
+      </w:r>
+      <w:r>
+        <w:rPr>
+          <w:rStyle w:val="VerbatimChar"/>
+        </w:rPr>
+        <w:t xml:space="preserve">#&gt;   &lt;dbl&gt; &lt;chr&gt; &lt;chr&gt;          &lt;dbl&gt;</w:t>
+      </w:r>
+      <w:r>
+        <w:br/>
+      </w:r>
+      <w:r>
+        <w:rPr>
+          <w:rStyle w:val="VerbatimChar"/>
+        </w:rPr>
+        <w:t xml:space="preserve">#&gt; 1 10.1  1     HlyE_IgA       0.184</w:t>
+      </w:r>
+      <w:r>
+        <w:br/>
+      </w:r>
+      <w:r>
+        <w:rPr>
+          <w:rStyle w:val="VerbatimChar"/>
+        </w:rPr>
+        <w:t xml:space="preserve">#&gt; 2 10.1  1     HlyE_IgG       0.194</w:t>
+      </w:r>
+      <w:r>
+        <w:br/>
+      </w:r>
+      <w:r>
+        <w:rPr>
+          <w:rStyle w:val="VerbatimChar"/>
+        </w:rPr>
+        <w:t xml:space="preserve">#&gt; 3  6.15 2     HlyE_IgA       5.79 </w:t>
+      </w:r>
+      <w:r>
+        <w:br/>
+      </w:r>
+      <w:r>
+        <w:rPr>
+          <w:rStyle w:val="VerbatimChar"/>
+        </w:rPr>
+        <w:t xml:space="preserve">#&gt; 4  6.15 2     HlyE_IgG    2423.   </w:t>
+      </w:r>
+      <w:r>
+        <w:br/>
+      </w:r>
+      <w:r>
+        <w:rPr>
+          <w:rStyle w:val="VerbatimChar"/>
+        </w:rPr>
+        <w:t xml:space="preserve">#&gt; 5  8.83 3     HlyE_IgA       1.45 </w:t>
+      </w:r>
+      <w:r>
+        <w:br/>
+      </w:r>
+      <w:r>
+        <w:rPr>
+          <w:rStyle w:val="VerbatimChar"/>
+        </w:rPr>
+        <w:t xml:space="preserve">#&gt; 6  8.83 3     HlyE_IgG       0.768</w:t>
       </w:r>
       <w:r>
         <w:br/>

</xml_diff>

<commit_message>
Deploying to gh-pages from @ UCD-SERG/serocalculator@d23bbe55ab139e920372331640cd27156bca303d 🚀
</commit_message>
<xml_diff>
--- a/dev/vignettes/articles/version-crosswalk-1.3-to-1.4.docx
+++ b/dev/vignettes/articles/version-crosswalk-1.3-to-1.4.docx
@@ -23,7 +23,7 @@
         <w:pStyle w:val="Date"/>
       </w:pPr>
       <w:r>
-        <w:t xml:space="preserve">2026-07-26</w:t>
+        <w:t xml:space="preserve">2026-07-27</w:t>
       </w:r>
     </w:p>
     <w:bookmarkStart w:id="9" w:name="overview"/>
@@ -3049,7 +3049,7 @@
         <w:rPr>
           <w:rStyle w:val="CommentTok"/>
         </w:rPr>
-        <w:t xml:space="preserve">#&gt;     age id    antigen_iso value</w:t>
+        <w:t xml:space="preserve">#&gt;     age id    antigen_iso   value</w:t>
       </w:r>
       <w:r>
         <w:br/>
@@ -3058,7 +3058,7 @@
         <w:rPr>
           <w:rStyle w:val="CommentTok"/>
         </w:rPr>
-        <w:t xml:space="preserve">#&gt;   &lt;dbl&gt; &lt;chr&gt; &lt;chr&gt;       &lt;dbl&gt;</w:t>
+        <w:t xml:space="preserve">#&gt;   &lt;dbl&gt; &lt;chr&gt; &lt;chr&gt;         &lt;dbl&gt;</w:t>
       </w:r>
       <w:r>
         <w:br/>
@@ -3067,7 +3067,7 @@
         <w:rPr>
           <w:rStyle w:val="CommentTok"/>
         </w:rPr>
-        <w:t xml:space="preserve">#&gt; 1 19.2  1     HlyE_IgA    0.484</w:t>
+        <w:t xml:space="preserve">#&gt; 1 18.8  1     HlyE_IgA      6.39 </w:t>
       </w:r>
       <w:r>
         <w:br/>
@@ -3076,7 +3076,7 @@
         <w:rPr>
           <w:rStyle w:val="CommentTok"/>
         </w:rPr>
-        <w:t xml:space="preserve">#&gt; 2 19.2  1     HlyE_IgG    1.46 </w:t>
+        <w:t xml:space="preserve">#&gt; 2 18.8  1     HlyE_IgG      1.71 </w:t>
       </w:r>
       <w:r>
         <w:br/>
@@ -3085,7 +3085,7 @@
         <w:rPr>
           <w:rStyle w:val="CommentTok"/>
         </w:rPr>
-        <w:t xml:space="preserve">#&gt; 3 13.1  2     HlyE_IgA    1.17 </w:t>
+        <w:t xml:space="preserve">#&gt; 3 19.0  2     HlyE_IgA     33.4  </w:t>
       </w:r>
       <w:r>
         <w:br/>
@@ -3094,7 +3094,7 @@
         <w:rPr>
           <w:rStyle w:val="CommentTok"/>
         </w:rPr>
-        <w:t xml:space="preserve">#&gt; 4 13.1  2     HlyE_IgG    0.767</w:t>
+        <w:t xml:space="preserve">#&gt; 4 19.0  2     HlyE_IgG    617.   </w:t>
       </w:r>
       <w:r>
         <w:br/>
@@ -3103,7 +3103,7 @@
         <w:rPr>
           <w:rStyle w:val="CommentTok"/>
         </w:rPr>
-        <w:t xml:space="preserve">#&gt; 5  9.05 3     HlyE_IgA    0.715</w:t>
+        <w:t xml:space="preserve">#&gt; 5  4.03 3     HlyE_IgA      0.491</w:t>
       </w:r>
       <w:r>
         <w:br/>
@@ -3112,7 +3112,7 @@
         <w:rPr>
           <w:rStyle w:val="CommentTok"/>
         </w:rPr>
-        <w:t xml:space="preserve">#&gt; 6  9.05 3     HlyE_IgG    0.703</w:t>
+        <w:t xml:space="preserve">#&gt; 6  4.03 3     HlyE_IgG      0.326</w:t>
       </w:r>
       <w:r>
         <w:br/>

</xml_diff>

<commit_message>
Deploying to gh-pages from @ UCD-SERG/serocalculator@9a700ff8f936f24af8d01169e337d88bcee10a0d 🚀
</commit_message>
<xml_diff>
--- a/dev/vignettes/articles/version-crosswalk-1.3-to-1.4.docx
+++ b/dev/vignettes/articles/version-crosswalk-1.3-to-1.4.docx
@@ -23,7 +23,7 @@
         <w:pStyle w:val="Date"/>
       </w:pPr>
       <w:r>
-        <w:t xml:space="preserve">2026-07-27</w:t>
+        <w:t xml:space="preserve">2026-07-28</w:t>
       </w:r>
     </w:p>
     <w:bookmarkStart w:id="9" w:name="overview"/>
@@ -3067,7 +3067,7 @@
         <w:rPr>
           <w:rStyle w:val="CommentTok"/>
         </w:rPr>
-        <w:t xml:space="preserve">#&gt; 1 18.8  1     HlyE_IgA      6.39 </w:t>
+        <w:t xml:space="preserve">#&gt; 1  9.98 1     HlyE_IgA      5.98 </w:t>
       </w:r>
       <w:r>
         <w:br/>
@@ -3076,7 +3076,7 @@
         <w:rPr>
           <w:rStyle w:val="CommentTok"/>
         </w:rPr>
-        <w:t xml:space="preserve">#&gt; 2 18.8  1     HlyE_IgG      1.71 </w:t>
+        <w:t xml:space="preserve">#&gt; 2  9.98 1     HlyE_IgG    131.   </w:t>
       </w:r>
       <w:r>
         <w:br/>
@@ -3085,7 +3085,7 @@
         <w:rPr>
           <w:rStyle w:val="CommentTok"/>
         </w:rPr>
-        <w:t xml:space="preserve">#&gt; 3 19.0  2     HlyE_IgA     33.4  </w:t>
+        <w:t xml:space="preserve">#&gt; 3  4.51 2     HlyE_IgA      1.63 </w:t>
       </w:r>
       <w:r>
         <w:br/>
@@ -3094,7 +3094,7 @@
         <w:rPr>
           <w:rStyle w:val="CommentTok"/>
         </w:rPr>
-        <w:t xml:space="preserve">#&gt; 4 19.0  2     HlyE_IgG    617.   </w:t>
+        <w:t xml:space="preserve">#&gt; 4  4.51 2     HlyE_IgG      3.78 </w:t>
       </w:r>
       <w:r>
         <w:br/>
@@ -3103,7 +3103,7 @@
         <w:rPr>
           <w:rStyle w:val="CommentTok"/>
         </w:rPr>
-        <w:t xml:space="preserve">#&gt; 5  4.03 3     HlyE_IgA      0.491</w:t>
+        <w:t xml:space="preserve">#&gt; 5 17.2  3     HlyE_IgA      0.973</w:t>
       </w:r>
       <w:r>
         <w:br/>
@@ -3112,7 +3112,7 @@
         <w:rPr>
           <w:rStyle w:val="CommentTok"/>
         </w:rPr>
-        <w:t xml:space="preserve">#&gt; 6  4.03 3     HlyE_IgG      0.326</w:t>
+        <w:t xml:space="preserve">#&gt; 6 17.2  3     HlyE_IgG      1.99</w:t>
       </w:r>
       <w:r>
         <w:br/>

</xml_diff>

<commit_message>
Deploying to gh-pages from @ UCD-SERG/serocalculator@26b2e6f318f22707186035e7af9139721d524f60 🚀
</commit_message>
<xml_diff>
--- a/dev/vignettes/articles/version-crosswalk-1.3-to-1.4.docx
+++ b/dev/vignettes/articles/version-crosswalk-1.3-to-1.4.docx
@@ -23,7 +23,7 @@
         <w:pStyle w:val="Date"/>
       </w:pPr>
       <w:r>
-        <w:t xml:space="preserve">2026-07-28</w:t>
+        <w:t xml:space="preserve">2026-07-30</w:t>
       </w:r>
     </w:p>
     <w:bookmarkStart w:id="9" w:name="overview"/>
@@ -3049,7 +3049,7 @@
         <w:rPr>
           <w:rStyle w:val="CommentTok"/>
         </w:rPr>
-        <w:t xml:space="preserve">#&gt;     age id    antigen_iso   value</w:t>
+        <w:t xml:space="preserve">#&gt;     age id    antigen_iso value</w:t>
       </w:r>
       <w:r>
         <w:br/>
@@ -3058,7 +3058,7 @@
         <w:rPr>
           <w:rStyle w:val="CommentTok"/>
         </w:rPr>
-        <w:t xml:space="preserve">#&gt;   &lt;dbl&gt; &lt;chr&gt; &lt;chr&gt;         &lt;dbl&gt;</w:t>
+        <w:t xml:space="preserve">#&gt;   &lt;dbl&gt; &lt;chr&gt; &lt;chr&gt;       &lt;dbl&gt;</w:t>
       </w:r>
       <w:r>
         <w:br/>
@@ -3067,7 +3067,7 @@
         <w:rPr>
           <w:rStyle w:val="CommentTok"/>
         </w:rPr>
-        <w:t xml:space="preserve">#&gt; 1  9.98 1     HlyE_IgA      5.98 </w:t>
+        <w:t xml:space="preserve">#&gt; 1  8.12 1     HlyE_IgA    0.559</w:t>
       </w:r>
       <w:r>
         <w:br/>
@@ -3076,7 +3076,7 @@
         <w:rPr>
           <w:rStyle w:val="CommentTok"/>
         </w:rPr>
-        <w:t xml:space="preserve">#&gt; 2  9.98 1     HlyE_IgG    131.   </w:t>
+        <w:t xml:space="preserve">#&gt; 2  8.12 1     HlyE_IgG    0.459</w:t>
       </w:r>
       <w:r>
         <w:br/>
@@ -3085,7 +3085,7 @@
         <w:rPr>
           <w:rStyle w:val="CommentTok"/>
         </w:rPr>
-        <w:t xml:space="preserve">#&gt; 3  4.51 2     HlyE_IgA      1.63 </w:t>
+        <w:t xml:space="preserve">#&gt; 3  3.94 2     HlyE_IgA    0.336</w:t>
       </w:r>
       <w:r>
         <w:br/>
@@ -3094,7 +3094,7 @@
         <w:rPr>
           <w:rStyle w:val="CommentTok"/>
         </w:rPr>
-        <w:t xml:space="preserve">#&gt; 4  4.51 2     HlyE_IgG      3.78 </w:t>
+        <w:t xml:space="preserve">#&gt; 4  3.94 2     HlyE_IgG    0.267</w:t>
       </w:r>
       <w:r>
         <w:br/>
@@ -3103,7 +3103,7 @@
         <w:rPr>
           <w:rStyle w:val="CommentTok"/>
         </w:rPr>
-        <w:t xml:space="preserve">#&gt; 5 17.2  3     HlyE_IgA      0.973</w:t>
+        <w:t xml:space="preserve">#&gt; 5  0.08 3     HlyE_IgA    0.615</w:t>
       </w:r>
       <w:r>
         <w:br/>
@@ -3112,7 +3112,7 @@
         <w:rPr>
           <w:rStyle w:val="CommentTok"/>
         </w:rPr>
-        <w:t xml:space="preserve">#&gt; 6 17.2  3     HlyE_IgG      1.99</w:t>
+        <w:t xml:space="preserve">#&gt; 6  0.08 3     HlyE_IgG    0.708</w:t>
       </w:r>
       <w:r>
         <w:br/>

</xml_diff>

<commit_message>
Deploying to gh-pages from @ UCD-SERG/serocalculator@7840fbbaf822387dba46a977c6719d24877a14a7 🚀
</commit_message>
<xml_diff>
--- a/dev/vignettes/articles/version-crosswalk-1.3-to-1.4.docx
+++ b/dev/vignettes/articles/version-crosswalk-1.3-to-1.4.docx
@@ -23,7 +23,7 @@
         <w:pStyle w:val="Date"/>
       </w:pPr>
       <w:r>
-        <w:t xml:space="preserve">2026-07-30</w:t>
+        <w:t xml:space="preserve">2026-07-31</w:t>
       </w:r>
     </w:p>
     <w:bookmarkStart w:id="9" w:name="overview"/>
@@ -3067,7 +3067,7 @@
         <w:rPr>
           <w:rStyle w:val="CommentTok"/>
         </w:rPr>
-        <w:t xml:space="preserve">#&gt; 1  8.12 1     HlyE_IgA    0.559</w:t>
+        <w:t xml:space="preserve">#&gt; 1  1.82 1     HlyE_IgA    0.567</w:t>
       </w:r>
       <w:r>
         <w:br/>
@@ -3076,7 +3076,7 @@
         <w:rPr>
           <w:rStyle w:val="CommentTok"/>
         </w:rPr>
-        <w:t xml:space="preserve">#&gt; 2  8.12 1     HlyE_IgG    0.459</w:t>
+        <w:t xml:space="preserve">#&gt; 2  1.82 1     HlyE_IgG    0.497</w:t>
       </w:r>
       <w:r>
         <w:br/>
@@ -3085,7 +3085,7 @@
         <w:rPr>
           <w:rStyle w:val="CommentTok"/>
         </w:rPr>
-        <w:t xml:space="preserve">#&gt; 3  3.94 2     HlyE_IgA    0.336</w:t>
+        <w:t xml:space="preserve">#&gt; 3 16.2  2     HlyE_IgA    4.19 </w:t>
       </w:r>
       <w:r>
         <w:br/>
@@ -3094,7 +3094,7 @@
         <w:rPr>
           <w:rStyle w:val="CommentTok"/>
         </w:rPr>
-        <w:t xml:space="preserve">#&gt; 4  3.94 2     HlyE_IgG    0.267</w:t>
+        <w:t xml:space="preserve">#&gt; 4 16.2  2     HlyE_IgG    5.49 </w:t>
       </w:r>
       <w:r>
         <w:br/>
@@ -3103,7 +3103,7 @@
         <w:rPr>
           <w:rStyle w:val="CommentTok"/>
         </w:rPr>
-        <w:t xml:space="preserve">#&gt; 5  0.08 3     HlyE_IgA    0.615</w:t>
+        <w:t xml:space="preserve">#&gt; 5 14.9  3     HlyE_IgA    0.677</w:t>
       </w:r>
       <w:r>
         <w:br/>
@@ -3112,7 +3112,7 @@
         <w:rPr>
           <w:rStyle w:val="CommentTok"/>
         </w:rPr>
-        <w:t xml:space="preserve">#&gt; 6  0.08 3     HlyE_IgG    0.708</w:t>
+        <w:t xml:space="preserve">#&gt; 6 14.9  3     HlyE_IgG    0.927</w:t>
       </w:r>
       <w:r>
         <w:br/>

</xml_diff>

<commit_message>
Deploying to gh-pages from @ UCD-SERG/serocalculator@1255839a8311d42399d682f0730af8c2011657e8 🚀
</commit_message>
<xml_diff>
--- a/dev/vignettes/articles/version-crosswalk-1.3-to-1.4.docx
+++ b/dev/vignettes/articles/version-crosswalk-1.3-to-1.4.docx
@@ -3049,7 +3049,7 @@
         <w:rPr>
           <w:rStyle w:val="CommentTok"/>
         </w:rPr>
-        <w:t xml:space="preserve">#&gt;     age id    antigen_iso value</w:t>
+        <w:t xml:space="preserve">#&gt;     age id    antigen_iso  value</w:t>
       </w:r>
       <w:r>
         <w:br/>
@@ -3058,7 +3058,7 @@
         <w:rPr>
           <w:rStyle w:val="CommentTok"/>
         </w:rPr>
-        <w:t xml:space="preserve">#&gt;   &lt;dbl&gt; &lt;chr&gt; &lt;chr&gt;       &lt;dbl&gt;</w:t>
+        <w:t xml:space="preserve">#&gt;   &lt;dbl&gt; &lt;chr&gt; &lt;chr&gt;        &lt;dbl&gt;</w:t>
       </w:r>
       <w:r>
         <w:br/>
@@ -3067,7 +3067,7 @@
         <w:rPr>
           <w:rStyle w:val="CommentTok"/>
         </w:rPr>
-        <w:t xml:space="preserve">#&gt; 1  1.82 1     HlyE_IgA    0.567</w:t>
+        <w:t xml:space="preserve">#&gt; 1  18.2 1     HlyE_IgA     5.95 </w:t>
       </w:r>
       <w:r>
         <w:br/>
@@ -3076,7 +3076,7 @@
         <w:rPr>
           <w:rStyle w:val="CommentTok"/>
         </w:rPr>
-        <w:t xml:space="preserve">#&gt; 2  1.82 1     HlyE_IgG    0.497</w:t>
+        <w:t xml:space="preserve">#&gt; 2  18.2 1     HlyE_IgG    16.7  </w:t>
       </w:r>
       <w:r>
         <w:br/>
@@ -3085,7 +3085,7 @@
         <w:rPr>
           <w:rStyle w:val="CommentTok"/>
         </w:rPr>
-        <w:t xml:space="preserve">#&gt; 3 16.2  2     HlyE_IgA    4.19 </w:t>
+        <w:t xml:space="preserve">#&gt; 3  18.6 2     HlyE_IgA     2.90 </w:t>
       </w:r>
       <w:r>
         <w:br/>
@@ -3094,7 +3094,7 @@
         <w:rPr>
           <w:rStyle w:val="CommentTok"/>
         </w:rPr>
-        <w:t xml:space="preserve">#&gt; 4 16.2  2     HlyE_IgG    5.49 </w:t>
+        <w:t xml:space="preserve">#&gt; 4  18.6 2     HlyE_IgG    57.7  </w:t>
       </w:r>
       <w:r>
         <w:br/>
@@ -3103,7 +3103,7 @@
         <w:rPr>
           <w:rStyle w:val="CommentTok"/>
         </w:rPr>
-        <w:t xml:space="preserve">#&gt; 5 14.9  3     HlyE_IgA    0.677</w:t>
+        <w:t xml:space="preserve">#&gt; 5  19.6 3     HlyE_IgA     2.04 </w:t>
       </w:r>
       <w:r>
         <w:br/>
@@ -3112,7 +3112,7 @@
         <w:rPr>
           <w:rStyle w:val="CommentTok"/>
         </w:rPr>
-        <w:t xml:space="preserve">#&gt; 6 14.9  3     HlyE_IgG    0.927</w:t>
+        <w:t xml:space="preserve">#&gt; 6  19.6 3     HlyE_IgG     0.777</w:t>
       </w:r>
       <w:r>
         <w:br/>

</xml_diff>

<commit_message>
Deploying to gh-pages from @ UCD-SERG/serocalculator@5b2d8eb33d14e817e7271017c0e345d203d329e2 🚀
</commit_message>
<xml_diff>
--- a/dev/vignettes/articles/version-crosswalk-1.3-to-1.4.docx
+++ b/dev/vignettes/articles/version-crosswalk-1.3-to-1.4.docx
@@ -23,7 +23,7 @@
         <w:pStyle w:val="Date"/>
       </w:pPr>
       <w:r>
-        <w:t xml:space="preserve">2026-07-31</w:t>
+        <w:t xml:space="preserve">2026-08-07</w:t>
       </w:r>
     </w:p>
     <w:bookmarkStart w:id="9" w:name="overview"/>
@@ -3049,7 +3049,7 @@
         <w:rPr>
           <w:rStyle w:val="CommentTok"/>
         </w:rPr>
-        <w:t xml:space="preserve">#&gt;     age id    antigen_iso  value</w:t>
+        <w:t xml:space="preserve">#&gt;     age id    antigen_iso value</w:t>
       </w:r>
       <w:r>
         <w:br/>
@@ -3058,7 +3058,7 @@
         <w:rPr>
           <w:rStyle w:val="CommentTok"/>
         </w:rPr>
-        <w:t xml:space="preserve">#&gt;   &lt;dbl&gt; &lt;chr&gt; &lt;chr&gt;        &lt;dbl&gt;</w:t>
+        <w:t xml:space="preserve">#&gt;   &lt;dbl&gt; &lt;chr&gt; &lt;chr&gt;       &lt;dbl&gt;</w:t>
       </w:r>
       <w:r>
         <w:br/>
@@ -3067,7 +3067,7 @@
         <w:rPr>
           <w:rStyle w:val="CommentTok"/>
         </w:rPr>
-        <w:t xml:space="preserve">#&gt; 1  18.2 1     HlyE_IgA     5.95 </w:t>
+        <w:t xml:space="preserve">#&gt; 1  1.98 1     HlyE_IgA    1.41 </w:t>
       </w:r>
       <w:r>
         <w:br/>
@@ -3076,7 +3076,7 @@
         <w:rPr>
           <w:rStyle w:val="CommentTok"/>
         </w:rPr>
-        <w:t xml:space="preserve">#&gt; 2  18.2 1     HlyE_IgG    16.7  </w:t>
+        <w:t xml:space="preserve">#&gt; 2  1.98 1     HlyE_IgG    8.65 </w:t>
       </w:r>
       <w:r>
         <w:br/>
@@ -3085,7 +3085,7 @@
         <w:rPr>
           <w:rStyle w:val="CommentTok"/>
         </w:rPr>
-        <w:t xml:space="preserve">#&gt; 3  18.6 2     HlyE_IgA     2.90 </w:t>
+        <w:t xml:space="preserve">#&gt; 3  8.59 2     HlyE_IgA    2.19 </w:t>
       </w:r>
       <w:r>
         <w:br/>
@@ -3094,7 +3094,7 @@
         <w:rPr>
           <w:rStyle w:val="CommentTok"/>
         </w:rPr>
-        <w:t xml:space="preserve">#&gt; 4  18.6 2     HlyE_IgG    57.7  </w:t>
+        <w:t xml:space="preserve">#&gt; 4  8.59 2     HlyE_IgG    5.87 </w:t>
       </w:r>
       <w:r>
         <w:br/>
@@ -3103,7 +3103,7 @@
         <w:rPr>
           <w:rStyle w:val="CommentTok"/>
         </w:rPr>
-        <w:t xml:space="preserve">#&gt; 5  19.6 3     HlyE_IgA     2.04 </w:t>
+        <w:t xml:space="preserve">#&gt; 5 15.2  3     HlyE_IgA    0.791</w:t>
       </w:r>
       <w:r>
         <w:br/>
@@ -3112,7 +3112,7 @@
         <w:rPr>
           <w:rStyle w:val="CommentTok"/>
         </w:rPr>
-        <w:t xml:space="preserve">#&gt; 6  19.6 3     HlyE_IgG     0.777</w:t>
+        <w:t xml:space="preserve">#&gt; 6 15.2  3     HlyE_IgG    2.55</w:t>
       </w:r>
       <w:r>
         <w:br/>

</xml_diff>

<commit_message>
Deploying to gh-pages from @ UCD-SERG/serocalculator@9421f0f049200e08a36827ff3f4235a6a6dd8390 🚀
</commit_message>
<xml_diff>
--- a/dev/vignettes/articles/version-crosswalk-1.3-to-1.4.docx
+++ b/dev/vignettes/articles/version-crosswalk-1.3-to-1.4.docx
@@ -3049,7 +3049,7 @@
         <w:rPr>
           <w:rStyle w:val="CommentTok"/>
         </w:rPr>
-        <w:t xml:space="preserve">#&gt;     age id    antigen_iso value</w:t>
+        <w:t xml:space="preserve">#&gt;     age id    antigen_iso  value</w:t>
       </w:r>
       <w:r>
         <w:br/>
@@ -3058,7 +3058,7 @@
         <w:rPr>
           <w:rStyle w:val="CommentTok"/>
         </w:rPr>
-        <w:t xml:space="preserve">#&gt;   &lt;dbl&gt; &lt;chr&gt; &lt;chr&gt;       &lt;dbl&gt;</w:t>
+        <w:t xml:space="preserve">#&gt;   &lt;dbl&gt; &lt;chr&gt; &lt;chr&gt;        &lt;dbl&gt;</w:t>
       </w:r>
       <w:r>
         <w:br/>
@@ -3067,7 +3067,7 @@
         <w:rPr>
           <w:rStyle w:val="CommentTok"/>
         </w:rPr>
-        <w:t xml:space="preserve">#&gt; 1  1.98 1     HlyE_IgA    1.41 </w:t>
+        <w:t xml:space="preserve">#&gt; 1  2.18 1     HlyE_IgA     0.766</w:t>
       </w:r>
       <w:r>
         <w:br/>
@@ -3076,7 +3076,7 @@
         <w:rPr>
           <w:rStyle w:val="CommentTok"/>
         </w:rPr>
-        <w:t xml:space="preserve">#&gt; 2  1.98 1     HlyE_IgG    8.65 </w:t>
+        <w:t xml:space="preserve">#&gt; 2  2.18 1     HlyE_IgG     0.386</w:t>
       </w:r>
       <w:r>
         <w:br/>
@@ -3085,7 +3085,7 @@
         <w:rPr>
           <w:rStyle w:val="CommentTok"/>
         </w:rPr>
-        <w:t xml:space="preserve">#&gt; 3  8.59 2     HlyE_IgA    2.19 </w:t>
+        <w:t xml:space="preserve">#&gt; 3 10.8  2     HlyE_IgA     1.48 </w:t>
       </w:r>
       <w:r>
         <w:br/>
@@ -3094,7 +3094,7 @@
         <w:rPr>
           <w:rStyle w:val="CommentTok"/>
         </w:rPr>
-        <w:t xml:space="preserve">#&gt; 4  8.59 2     HlyE_IgG    5.87 </w:t>
+        <w:t xml:space="preserve">#&gt; 4 10.8  2     HlyE_IgG     1.39 </w:t>
       </w:r>
       <w:r>
         <w:br/>
@@ -3103,7 +3103,7 @@
         <w:rPr>
           <w:rStyle w:val="CommentTok"/>
         </w:rPr>
-        <w:t xml:space="preserve">#&gt; 5 15.2  3     HlyE_IgA    0.791</w:t>
+        <w:t xml:space="preserve">#&gt; 5 19.2  3     HlyE_IgA    45.4  </w:t>
       </w:r>
       <w:r>
         <w:br/>
@@ -3112,7 +3112,7 @@
         <w:rPr>
           <w:rStyle w:val="CommentTok"/>
         </w:rPr>
-        <w:t xml:space="preserve">#&gt; 6 15.2  3     HlyE_IgG    2.55</w:t>
+        <w:t xml:space="preserve">#&gt; 6 19.2  3     HlyE_IgG    57.0</w:t>
       </w:r>
       <w:r>
         <w:br/>

</xml_diff>

<commit_message>
Deploying to gh-pages from @ UCD-SERG/serocalculator@984840e96e1e8070b016cd90dd6928defcd5dfc9 🚀
</commit_message>
<xml_diff>
--- a/dev/vignettes/articles/version-crosswalk-1.3-to-1.4.docx
+++ b/dev/vignettes/articles/version-crosswalk-1.3-to-1.4.docx
@@ -23,7 +23,7 @@
         <w:pStyle w:val="Date"/>
       </w:pPr>
       <w:r>
-        <w:t xml:space="preserve">2026-08-07</w:t>
+        <w:t xml:space="preserve">2026-08-08</w:t>
       </w:r>
     </w:p>
     <w:bookmarkStart w:id="9" w:name="overview"/>
@@ -3049,7 +3049,7 @@
         <w:rPr>
           <w:rStyle w:val="CommentTok"/>
         </w:rPr>
-        <w:t xml:space="preserve">#&gt;     age id    antigen_iso  value</w:t>
+        <w:t xml:space="preserve">#&gt;     age id    antigen_iso value</w:t>
       </w:r>
       <w:r>
         <w:br/>
@@ -3058,7 +3058,7 @@
         <w:rPr>
           <w:rStyle w:val="CommentTok"/>
         </w:rPr>
-        <w:t xml:space="preserve">#&gt;   &lt;dbl&gt; &lt;chr&gt; &lt;chr&gt;        &lt;dbl&gt;</w:t>
+        <w:t xml:space="preserve">#&gt;   &lt;dbl&gt; &lt;chr&gt; &lt;chr&gt;       &lt;dbl&gt;</w:t>
       </w:r>
       <w:r>
         <w:br/>
@@ -3067,7 +3067,7 @@
         <w:rPr>
           <w:rStyle w:val="CommentTok"/>
         </w:rPr>
-        <w:t xml:space="preserve">#&gt; 1  2.18 1     HlyE_IgA     0.766</w:t>
+        <w:t xml:space="preserve">#&gt; 1 16.4  1     HlyE_IgA    0.695</w:t>
       </w:r>
       <w:r>
         <w:br/>
@@ -3076,7 +3076,7 @@
         <w:rPr>
           <w:rStyle w:val="CommentTok"/>
         </w:rPr>
-        <w:t xml:space="preserve">#&gt; 2  2.18 1     HlyE_IgG     0.386</w:t>
+        <w:t xml:space="preserve">#&gt; 2 16.4  1     HlyE_IgG    0.706</w:t>
       </w:r>
       <w:r>
         <w:br/>
@@ -3085,7 +3085,7 @@
         <w:rPr>
           <w:rStyle w:val="CommentTok"/>
         </w:rPr>
-        <w:t xml:space="preserve">#&gt; 3 10.8  2     HlyE_IgA     1.48 </w:t>
+        <w:t xml:space="preserve">#&gt; 3 16.4  2     HlyE_IgA    0.419</w:t>
       </w:r>
       <w:r>
         <w:br/>
@@ -3094,7 +3094,7 @@
         <w:rPr>
           <w:rStyle w:val="CommentTok"/>
         </w:rPr>
-        <w:t xml:space="preserve">#&gt; 4 10.8  2     HlyE_IgG     1.39 </w:t>
+        <w:t xml:space="preserve">#&gt; 4 16.4  2     HlyE_IgG    0.575</w:t>
       </w:r>
       <w:r>
         <w:br/>
@@ -3103,7 +3103,7 @@
         <w:rPr>
           <w:rStyle w:val="CommentTok"/>
         </w:rPr>
-        <w:t xml:space="preserve">#&gt; 5 19.2  3     HlyE_IgA    45.4  </w:t>
+        <w:t xml:space="preserve">#&gt; 5  9.86 3     HlyE_IgA    2.49 </w:t>
       </w:r>
       <w:r>
         <w:br/>
@@ -3112,7 +3112,7 @@
         <w:rPr>
           <w:rStyle w:val="CommentTok"/>
         </w:rPr>
-        <w:t xml:space="preserve">#&gt; 6 19.2  3     HlyE_IgG    57.0</w:t>
+        <w:t xml:space="preserve">#&gt; 6  9.86 3     HlyE_IgG    2.52</w:t>
       </w:r>
       <w:r>
         <w:br/>

</xml_diff>

<commit_message>
Deploying to gh-pages from @ UCD-SERG/serocalculator@d23d6751251ef15693bd004a43de6b2dbca17db6 🚀
</commit_message>
<xml_diff>
--- a/dev/vignettes/articles/version-crosswalk-1.3-to-1.4.docx
+++ b/dev/vignettes/articles/version-crosswalk-1.3-to-1.4.docx
@@ -3049,7 +3049,7 @@
         <w:rPr>
           <w:rStyle w:val="CommentTok"/>
         </w:rPr>
-        <w:t xml:space="preserve">#&gt;     age id    antigen_iso  value</w:t>
+        <w:t xml:space="preserve">#&gt;     age id    antigen_iso value</w:t>
       </w:r>
       <w:r>
         <w:br/>
@@ -3058,7 +3058,7 @@
         <w:rPr>
           <w:rStyle w:val="CommentTok"/>
         </w:rPr>
-        <w:t xml:space="preserve">#&gt;   &lt;dbl&gt; &lt;chr&gt; &lt;chr&gt;        &lt;dbl&gt;</w:t>
+        <w:t xml:space="preserve">#&gt;   &lt;dbl&gt; &lt;chr&gt; &lt;chr&gt;       &lt;dbl&gt;</w:t>
       </w:r>
       <w:r>
         <w:br/>
@@ -3067,7 +3067,7 @@
         <w:rPr>
           <w:rStyle w:val="CommentTok"/>
         </w:rPr>
-        <w:t xml:space="preserve">#&gt; 1  6.8  1     HlyE_IgA     1.60 </w:t>
+        <w:t xml:space="preserve">#&gt; 1 17.9  1     HlyE_IgA    0.531</w:t>
       </w:r>
       <w:r>
         <w:br/>
@@ -3076,7 +3076,7 @@
         <w:rPr>
           <w:rStyle w:val="CommentTok"/>
         </w:rPr>
-        <w:t xml:space="preserve">#&gt; 2  6.8  1     HlyE_IgG     8.21 </w:t>
+        <w:t xml:space="preserve">#&gt; 2 17.9  1     HlyE_IgG    0.374</w:t>
       </w:r>
       <w:r>
         <w:br/>
@@ -3085,7 +3085,7 @@
         <w:rPr>
           <w:rStyle w:val="CommentTok"/>
         </w:rPr>
-        <w:t xml:space="preserve">#&gt; 3  7.84 2     HlyE_IgA    15.0  </w:t>
+        <w:t xml:space="preserve">#&gt; 3  1.64 2     HlyE_IgA    0.253</w:t>
       </w:r>
       <w:r>
         <w:br/>
@@ -3094,7 +3094,7 @@
         <w:rPr>
           <w:rStyle w:val="CommentTok"/>
         </w:rPr>
-        <w:t xml:space="preserve">#&gt; 4  7.84 2     HlyE_IgG     5.74 </w:t>
+        <w:t xml:space="preserve">#&gt; 4  1.64 2     HlyE_IgG    0.463</w:t>
       </w:r>
       <w:r>
         <w:br/>
@@ -3103,7 +3103,7 @@
         <w:rPr>
           <w:rStyle w:val="CommentTok"/>
         </w:rPr>
-        <w:t xml:space="preserve">#&gt; 5  1.26 3     HlyE_IgA     0.693</w:t>
+        <w:t xml:space="preserve">#&gt; 5  3.43 3     HlyE_IgA    0.106</w:t>
       </w:r>
       <w:r>
         <w:br/>
@@ -3112,7 +3112,7 @@
         <w:rPr>
           <w:rStyle w:val="CommentTok"/>
         </w:rPr>
-        <w:t xml:space="preserve">#&gt; 6  1.26 3     HlyE_IgG     0.548</w:t>
+        <w:t xml:space="preserve">#&gt; 6  3.43 3     HlyE_IgG    0.537</w:t>
       </w:r>
       <w:r>
         <w:br/>

</xml_diff>

<commit_message>
Deploying to gh-pages from @ UCD-SERG/serocalculator@4a9ab8fe7e7c7bbf787764d06f5545cfdf2fb13b 🚀
</commit_message>
<xml_diff>
--- a/dev/vignettes/articles/version-crosswalk-1.3-to-1.4.docx
+++ b/dev/vignettes/articles/version-crosswalk-1.3-to-1.4.docx
@@ -23,7 +23,7 @@
         <w:pStyle w:val="Date"/>
       </w:pPr>
       <w:r>
-        <w:t xml:space="preserve">2026-08-08</w:t>
+        <w:t xml:space="preserve">2026-08-09</w:t>
       </w:r>
     </w:p>
     <w:bookmarkStart w:id="9" w:name="overview"/>
@@ -3049,7 +3049,7 @@
         <w:rPr>
           <w:rStyle w:val="CommentTok"/>
         </w:rPr>
-        <w:t xml:space="preserve">#&gt;     age id    antigen_iso value</w:t>
+        <w:t xml:space="preserve">#&gt;     age id    antigen_iso   value</w:t>
       </w:r>
       <w:r>
         <w:br/>
@@ -3058,7 +3058,7 @@
         <w:rPr>
           <w:rStyle w:val="CommentTok"/>
         </w:rPr>
-        <w:t xml:space="preserve">#&gt;   &lt;dbl&gt; &lt;chr&gt; &lt;chr&gt;       &lt;dbl&gt;</w:t>
+        <w:t xml:space="preserve">#&gt;   &lt;dbl&gt; &lt;chr&gt; &lt;chr&gt;         &lt;dbl&gt;</w:t>
       </w:r>
       <w:r>
         <w:br/>
@@ -3067,7 +3067,7 @@
         <w:rPr>
           <w:rStyle w:val="CommentTok"/>
         </w:rPr>
-        <w:t xml:space="preserve">#&gt; 1 17.9  1     HlyE_IgA    0.531</w:t>
+        <w:t xml:space="preserve">#&gt; 1 19.8  1     HlyE_IgA      8.85 </w:t>
       </w:r>
       <w:r>
         <w:br/>
@@ -3076,7 +3076,7 @@
         <w:rPr>
           <w:rStyle w:val="CommentTok"/>
         </w:rPr>
-        <w:t xml:space="preserve">#&gt; 2 17.9  1     HlyE_IgG    0.374</w:t>
+        <w:t xml:space="preserve">#&gt; 2 19.8  1     HlyE_IgG    664.   </w:t>
       </w:r>
       <w:r>
         <w:br/>
@@ -3085,7 +3085,7 @@
         <w:rPr>
           <w:rStyle w:val="CommentTok"/>
         </w:rPr>
-        <w:t xml:space="preserve">#&gt; 3  1.64 2     HlyE_IgA    0.253</w:t>
+        <w:t xml:space="preserve">#&gt; 3  2.61 2     HlyE_IgA      0.303</w:t>
       </w:r>
       <w:r>
         <w:br/>
@@ -3094,7 +3094,7 @@
         <w:rPr>
           <w:rStyle w:val="CommentTok"/>
         </w:rPr>
-        <w:t xml:space="preserve">#&gt; 4  1.64 2     HlyE_IgG    0.463</w:t>
+        <w:t xml:space="preserve">#&gt; 4  2.61 2     HlyE_IgG      0.798</w:t>
       </w:r>
       <w:r>
         <w:br/>
@@ -3103,7 +3103,7 @@
         <w:rPr>
           <w:rStyle w:val="CommentTok"/>
         </w:rPr>
-        <w:t xml:space="preserve">#&gt; 5  3.43 3     HlyE_IgA    0.106</w:t>
+        <w:t xml:space="preserve">#&gt; 5  7.16 3     HlyE_IgA      0.540</w:t>
       </w:r>
       <w:r>
         <w:br/>
@@ -3112,7 +3112,7 @@
         <w:rPr>
           <w:rStyle w:val="CommentTok"/>
         </w:rPr>
-        <w:t xml:space="preserve">#&gt; 6  3.43 3     HlyE_IgG    0.537</w:t>
+        <w:t xml:space="preserve">#&gt; 6  7.16 3     HlyE_IgG      1.55</w:t>
       </w:r>
       <w:r>
         <w:br/>

</xml_diff>

<commit_message>
Deploying to gh-pages from @ UCD-SERG/serocalculator@ee7020352cd3ca289da922a90745a9ad322094ca 🚀
</commit_message>
<xml_diff>
--- a/dev/vignettes/articles/version-crosswalk-1.3-to-1.4.docx
+++ b/dev/vignettes/articles/version-crosswalk-1.3-to-1.4.docx
@@ -3049,7 +3049,7 @@
         <w:rPr>
           <w:rStyle w:val="CommentTok"/>
         </w:rPr>
-        <w:t xml:space="preserve">#&gt;     age id    antigen_iso   value</w:t>
+        <w:t xml:space="preserve">#&gt;     age id    antigen_iso    value</w:t>
       </w:r>
       <w:r>
         <w:br/>
@@ -3058,7 +3058,7 @@
         <w:rPr>
           <w:rStyle w:val="CommentTok"/>
         </w:rPr>
-        <w:t xml:space="preserve">#&gt;   &lt;dbl&gt; &lt;chr&gt; &lt;chr&gt;         &lt;dbl&gt;</w:t>
+        <w:t xml:space="preserve">#&gt;   &lt;dbl&gt; &lt;chr&gt; &lt;chr&gt;          &lt;dbl&gt;</w:t>
       </w:r>
       <w:r>
         <w:br/>
@@ -3067,7 +3067,7 @@
         <w:rPr>
           <w:rStyle w:val="CommentTok"/>
         </w:rPr>
-        <w:t xml:space="preserve">#&gt; 1 19.8  1     HlyE_IgA      8.85 </w:t>
+        <w:t xml:space="preserve">#&gt; 1  1.05 1     HlyE_IgA       0.207</w:t>
       </w:r>
       <w:r>
         <w:br/>
@@ -3076,7 +3076,7 @@
         <w:rPr>
           <w:rStyle w:val="CommentTok"/>
         </w:rPr>
-        <w:t xml:space="preserve">#&gt; 2 19.8  1     HlyE_IgG    664.   </w:t>
+        <w:t xml:space="preserve">#&gt; 2  1.05 1     HlyE_IgG       0.639</w:t>
       </w:r>
       <w:r>
         <w:br/>
@@ -3085,7 +3085,7 @@
         <w:rPr>
           <w:rStyle w:val="CommentTok"/>
         </w:rPr>
-        <w:t xml:space="preserve">#&gt; 3  2.61 2     HlyE_IgA      0.303</w:t>
+        <w:t xml:space="preserve">#&gt; 3 13.3  2     HlyE_IgA       0.691</w:t>
       </w:r>
       <w:r>
         <w:br/>
@@ -3094,7 +3094,7 @@
         <w:rPr>
           <w:rStyle w:val="CommentTok"/>
         </w:rPr>
-        <w:t xml:space="preserve">#&gt; 4  2.61 2     HlyE_IgG      0.798</w:t>
+        <w:t xml:space="preserve">#&gt; 4 13.3  2     HlyE_IgG       2.35 </w:t>
       </w:r>
       <w:r>
         <w:br/>
@@ -3103,7 +3103,7 @@
         <w:rPr>
           <w:rStyle w:val="CommentTok"/>
         </w:rPr>
-        <w:t xml:space="preserve">#&gt; 5  7.16 3     HlyE_IgA      0.540</w:t>
+        <w:t xml:space="preserve">#&gt; 5  4.03 3     HlyE_IgA       1.56 </w:t>
       </w:r>
       <w:r>
         <w:br/>
@@ -3112,7 +3112,7 @@
         <w:rPr>
           <w:rStyle w:val="CommentTok"/>
         </w:rPr>
-        <w:t xml:space="preserve">#&gt; 6  7.16 3     HlyE_IgG      1.55</w:t>
+        <w:t xml:space="preserve">#&gt; 6  4.03 3     HlyE_IgG    1624.</w:t>
       </w:r>
       <w:r>
         <w:br/>

</xml_diff>

<commit_message>
Deploying to gh-pages from @ UCD-SERG/serocalculator@ad4a92263bec209f505e99253c50183af30ad2cd 🚀
</commit_message>
<xml_diff>
--- a/dev/vignettes/articles/version-crosswalk-1.3-to-1.4.docx
+++ b/dev/vignettes/articles/version-crosswalk-1.3-to-1.4.docx
@@ -23,7 +23,7 @@
         <w:pStyle w:val="Date"/>
       </w:pPr>
       <w:r>
-        <w:t xml:space="preserve">2026-08-09</w:t>
+        <w:t xml:space="preserve">2026-08-10</w:t>
       </w:r>
     </w:p>
     <w:bookmarkStart w:id="9" w:name="overview"/>
@@ -3049,7 +3049,7 @@
         <w:rPr>
           <w:rStyle w:val="CommentTok"/>
         </w:rPr>
-        <w:t xml:space="preserve">#&gt;     age id    antigen_iso    value</w:t>
+        <w:t xml:space="preserve">#&gt;     age id    antigen_iso value</w:t>
       </w:r>
       <w:r>
         <w:br/>
@@ -3058,7 +3058,7 @@
         <w:rPr>
           <w:rStyle w:val="CommentTok"/>
         </w:rPr>
-        <w:t xml:space="preserve">#&gt;   &lt;dbl&gt; &lt;chr&gt; &lt;chr&gt;          &lt;dbl&gt;</w:t>
+        <w:t xml:space="preserve">#&gt;   &lt;dbl&gt; &lt;chr&gt; &lt;chr&gt;       &lt;dbl&gt;</w:t>
       </w:r>
       <w:r>
         <w:br/>
@@ -3067,7 +3067,7 @@
         <w:rPr>
           <w:rStyle w:val="CommentTok"/>
         </w:rPr>
-        <w:t xml:space="preserve">#&gt; 1  1.05 1     HlyE_IgA       0.207</w:t>
+        <w:t xml:space="preserve">#&gt; 1  19   1     HlyE_IgA    0.378</w:t>
       </w:r>
       <w:r>
         <w:br/>
@@ -3076,7 +3076,7 @@
         <w:rPr>
           <w:rStyle w:val="CommentTok"/>
         </w:rPr>
-        <w:t xml:space="preserve">#&gt; 2  1.05 1     HlyE_IgG       0.639</w:t>
+        <w:t xml:space="preserve">#&gt; 2  19   1     HlyE_IgG    0.773</w:t>
       </w:r>
       <w:r>
         <w:br/>
@@ -3085,7 +3085,7 @@
         <w:rPr>
           <w:rStyle w:val="CommentTok"/>
         </w:rPr>
-        <w:t xml:space="preserve">#&gt; 3 13.3  2     HlyE_IgA       0.691</w:t>
+        <w:t xml:space="preserve">#&gt; 3  11.5 2     HlyE_IgA    0.458</w:t>
       </w:r>
       <w:r>
         <w:br/>
@@ -3094,7 +3094,7 @@
         <w:rPr>
           <w:rStyle w:val="CommentTok"/>
         </w:rPr>
-        <w:t xml:space="preserve">#&gt; 4 13.3  2     HlyE_IgG       2.35 </w:t>
+        <w:t xml:space="preserve">#&gt; 4  11.5 2     HlyE_IgG    1.11 </w:t>
       </w:r>
       <w:r>
         <w:br/>
@@ -3103,7 +3103,7 @@
         <w:rPr>
           <w:rStyle w:val="CommentTok"/>
         </w:rPr>
-        <w:t xml:space="preserve">#&gt; 5  4.03 3     HlyE_IgA       1.56 </w:t>
+        <w:t xml:space="preserve">#&gt; 5  17.2 3     HlyE_IgA    0.734</w:t>
       </w:r>
       <w:r>
         <w:br/>
@@ -3112,7 +3112,7 @@
         <w:rPr>
           <w:rStyle w:val="CommentTok"/>
         </w:rPr>
-        <w:t xml:space="preserve">#&gt; 6  4.03 3     HlyE_IgG    1624.</w:t>
+        <w:t xml:space="preserve">#&gt; 6  17.2 3     HlyE_IgG    0.122</w:t>
       </w:r>
       <w:r>
         <w:br/>

</xml_diff>

<commit_message>
Deploying to gh-pages from @ UCD-SERG/serocalculator@f77bec425c808244d102d9873b27cebb4119033c 🚀
</commit_message>
<xml_diff>
--- a/dev/vignettes/articles/version-crosswalk-1.3-to-1.4.docx
+++ b/dev/vignettes/articles/version-crosswalk-1.3-to-1.4.docx
@@ -23,7 +23,7 @@
         <w:pStyle w:val="Date"/>
       </w:pPr>
       <w:r>
-        <w:t xml:space="preserve">2026-08-10</w:t>
+        <w:t xml:space="preserve">2026-09-02</w:t>
       </w:r>
     </w:p>
     <w:bookmarkStart w:id="9" w:name="overview"/>
@@ -3049,7 +3049,7 @@
         <w:rPr>
           <w:rStyle w:val="CommentTok"/>
         </w:rPr>
-        <w:t xml:space="preserve">#&gt;     age id    antigen_iso value</w:t>
+        <w:t xml:space="preserve">#&gt;     age id    antigen_iso   value</w:t>
       </w:r>
       <w:r>
         <w:br/>
@@ -3058,7 +3058,7 @@
         <w:rPr>
           <w:rStyle w:val="CommentTok"/>
         </w:rPr>
-        <w:t xml:space="preserve">#&gt;   &lt;dbl&gt; &lt;chr&gt; &lt;chr&gt;       &lt;dbl&gt;</w:t>
+        <w:t xml:space="preserve">#&gt;   &lt;dbl&gt; &lt;chr&gt; &lt;chr&gt;         &lt;dbl&gt;</w:t>
       </w:r>
       <w:r>
         <w:br/>
@@ -3067,7 +3067,7 @@
         <w:rPr>
           <w:rStyle w:val="CommentTok"/>
         </w:rPr>
-        <w:t xml:space="preserve">#&gt; 1  19   1     HlyE_IgA    0.378</w:t>
+        <w:t xml:space="preserve">#&gt; 1 14.2  1     HlyE_IgA       2.51</w:t>
       </w:r>
       <w:r>
         <w:br/>
@@ -3076,7 +3076,7 @@
         <w:rPr>
           <w:rStyle w:val="CommentTok"/>
         </w:rPr>
-        <w:t xml:space="preserve">#&gt; 2  19   1     HlyE_IgG    0.773</w:t>
+        <w:t xml:space="preserve">#&gt; 2 14.2  1     HlyE_IgG       8.41</w:t>
       </w:r>
       <w:r>
         <w:br/>
@@ -3085,7 +3085,7 @@
         <w:rPr>
           <w:rStyle w:val="CommentTok"/>
         </w:rPr>
-        <w:t xml:space="preserve">#&gt; 3  11.5 2     HlyE_IgA    0.458</w:t>
+        <w:t xml:space="preserve">#&gt; 3 19.8  2     HlyE_IgA       1.26</w:t>
       </w:r>
       <w:r>
         <w:br/>
@@ -3094,7 +3094,7 @@
         <w:rPr>
           <w:rStyle w:val="CommentTok"/>
         </w:rPr>
-        <w:t xml:space="preserve">#&gt; 4  11.5 2     HlyE_IgG    1.11 </w:t>
+        <w:t xml:space="preserve">#&gt; 4 19.8  2     HlyE_IgG      43.2 </w:t>
       </w:r>
       <w:r>
         <w:br/>
@@ -3103,7 +3103,7 @@
         <w:rPr>
           <w:rStyle w:val="CommentTok"/>
         </w:rPr>
-        <w:t xml:space="preserve">#&gt; 5  17.2 3     HlyE_IgA    0.734</w:t>
+        <w:t xml:space="preserve">#&gt; 5  5.74 3     HlyE_IgA     112.  </w:t>
       </w:r>
       <w:r>
         <w:br/>
@@ -3112,7 +3112,7 @@
         <w:rPr>
           <w:rStyle w:val="CommentTok"/>
         </w:rPr>
-        <w:t xml:space="preserve">#&gt; 6  17.2 3     HlyE_IgG    0.122</w:t>
+        <w:t xml:space="preserve">#&gt; 6  5.74 3     HlyE_IgG    4327.</w:t>
       </w:r>
       <w:r>
         <w:br/>

</xml_diff>